<commit_message>
docs: regenerate Final_Project_Writeup.docx with all 17 models
Updates generate_assignment_report.py:
- Add SAM2 Masked CNN row to results table (74.48%)
- Add YOLOv8n end-to-end row (86.3% mAP50)
- Expand experimentation section with masked CNN finding
- Fix YOLO confusion matrix path to use results/models/yolo_e2e_confusion.png
- Add masked CNN and full experiment comparison chart to appendix

Co-Authored-By: Claude Sonnet 4.6 <noreply@anthropic.com>
</commit_message>
<xml_diff>
--- a/docs/Final_Project_Writeup.docx
+++ b/docs/Final_Project_Writeup.docx
@@ -305,7 +305,7 @@
           </w:tcPr>
           <w:p>
             <w:r>
-              <w:t>YOLOv8 End to End</w:t>
+              <w:t>YOLOv8n End to End (5 class)</w:t>
             </w:r>
           </w:p>
         </w:tc>
@@ -325,7 +325,39 @@
           </w:tcPr>
           <w:p>
             <w:r>
-              <w:t>0.873 Precision</w:t>
+              <w:t>86.3 percent mAP50</w:t>
+            </w:r>
+          </w:p>
+        </w:tc>
+      </w:tr>
+      <w:tr>
+        <w:tc>
+          <w:tcPr>
+            <w:tcW w:type="dxa" w:w="2880"/>
+          </w:tcPr>
+          <w:p>
+            <w:r>
+              <w:t>SAM2 Masked CNN</w:t>
+            </w:r>
+          </w:p>
+        </w:tc>
+        <w:tc>
+          <w:tcPr>
+            <w:tcW w:type="dxa" w:w="2880"/>
+          </w:tcPr>
+          <w:p>
+            <w:r>
+              <w:t>Synthetic background removal</w:t>
+            </w:r>
+          </w:p>
+        </w:tc>
+        <w:tc>
+          <w:tcPr>
+            <w:tcW w:type="dxa" w:w="2880"/>
+          </w:tcPr>
+          <w:p>
+            <w:r>
+              <w:t>74.48 percent</w:t>
             </w:r>
           </w:p>
         </w:tc>
@@ -334,7 +366,7 @@
     <w:p>
       <w:r>
         <w:br/>
-        <w:t>As the table shows, the custom Convolutional Neural Network achieved 87.33 percent, which vastly outperformed traditional machine learning models but lacked scalable depth. A blank ResNet parameter model trained strictly from scratch achieved 79.23 percent. This proved that large networks struggle heavily without pretrained generalized anchors. However, a frozen ResNet loaded with ImageNet weights efficiently achieved 79.82 percent just by training its final layer. A natively fine tuned Vision Transformer achieved state of the art pure classification precision at 93.90 percent. Finally, YOLO natively scanned raw scenes end to end and localized objects with an incredible precision mapping of 0.873.</w:t>
+        <w:t>As the table shows, the custom Convolutional Neural Network achieved 87.33 percent, which vastly outperformed traditional machine learning models but lacked scalable depth. A blank ResNet parameter model trained strictly from scratch achieved 79.23 percent. This proved that large networks struggle heavily without pretrained generalized anchors. However, a frozen ResNet loaded with ImageNet weights efficiently achieved 79.82 percent just by training its final layer. A natively fine tuned Vision Transformer achieved state of the art pure classification precision at 93.90 percent. Our end to end YOLOv8n detector trained directly on all five PPE classes achieved a strong mAP50 of 86.3 percent across 2609 scenes. The SAM2 masked CNN experiment showed that zeroing out scene backgrounds actually reduced accuracy to 74.48 percent, demonstrating that contextual body and scene information assists classification rather than harming it.</w:t>
       </w:r>
     </w:p>
     <w:p>
@@ -347,7 +379,7 @@
     </w:p>
     <w:p>
       <w:r>
-        <w:t>Our experimentation directly evaluated the tradeoffs between custom layouts and advanced transfer learning models. Deploying frozen backbones provided much faster convergence speeds compared to a blank model. This proved that generalized visual features easily transition to obscure safety classification tasks. However, without unfreezing the entire network for a full fine tuning process, rigid architectures struggled to untangle the visual similarity between bright yellow clothing and actual safety vests. Ultimately, integrating transfer learning via Vision Transformers established our highest global precision point at 93.90 percent. Unfortunately, its massive parameter complexity created slow processing speeds compared to our custom simple network. Conversely, deploying our YOLO framework entirely bypassed the slow cropping phase to secure top tier detection directly on raw video frames. For scalable real time inference across camera streams, this approach provides massive operational value in environments constrained by tracking speed and latency.</w:t>
+        <w:t>Our experimentation directly evaluated the tradeoffs between custom layouts and advanced transfer learning models. Deploying frozen backbones provided much faster convergence speeds compared to a blank model. This proved that generalized visual features easily transition to obscure safety classification tasks. However, without unfreezing the entire network for a full fine tuning process, rigid architectures struggled to untangle the visual similarity between bright yellow clothing and actual safety vests. Ultimately, integrating transfer learning via Vision Transformers established our highest global precision point at 93.90 percent. Unfortunately, its massive parameter complexity created slow processing speeds compared to our custom simple network. Conversely, deploying our YOLO framework entirely bypassed the slow cropping phase to secure top tier detection directly on raw video frames. For scalable real time inference across camera streams, this approach provides massive operational value in environments constrained by tracking speed and latency. Our synthetic masking experiment using SAM2 pseudo masks revealed an important insight: removing background context actually degraded classification performance from 87.33 percent down to 74.48 percent. This finding confirms that PPE classifiers benefit from surrounding body and environment context when distinguishing between partial and full safety equipment coverage.</w:t>
       </w:r>
     </w:p>
     <w:p>
@@ -378,7 +410,7 @@
       <w:r>
         <w:drawing>
           <wp:inline xmlns:a="http://schemas.openxmlformats.org/drawingml/2006/main" xmlns:pic="http://schemas.openxmlformats.org/drawingml/2006/picture">
-            <wp:extent cx="5029200" cy="3771900"/>
+            <wp:extent cx="5029200" cy="4310743"/>
             <wp:docPr id="1" name="Picture 1"/>
             <wp:cNvGraphicFramePr>
               <a:graphicFrameLocks noChangeAspect="1"/>
@@ -399,7 +431,7 @@
                   <pic:spPr>
                     <a:xfrm>
                       <a:off x="0" y="0"/>
-                      <a:ext cx="5029200" cy="3771900"/>
+                      <a:ext cx="5029200" cy="4310743"/>
                     </a:xfrm>
                     <a:prstGeom prst="rect"/>
                   </pic:spPr>
@@ -415,7 +447,7 @@
         <w:pStyle w:val="Heading3"/>
       </w:pPr>
       <w:r>
-        <w:t>YOLOv8 End to End Object Detection Confusion Matrix (Testing Data)</w:t>
+        <w:t>YOLOv8n End to End Object Detection Confusion Matrix (Testing Data)</w:t>
       </w:r>
     </w:p>
     <w:p>
@@ -434,7 +466,7 @@
               <a:graphicData uri="http://schemas.openxmlformats.org/drawingml/2006/picture">
                 <pic:pic>
                   <pic:nvPicPr>
-                    <pic:cNvPr id="0" name="confusion_matrix.png"/>
+                    <pic:cNvPr id="0" name="yolo_e2e_confusion.png"/>
                     <pic:cNvPicPr/>
                   </pic:nvPicPr>
                   <pic:blipFill>
@@ -588,6 +620,100 @@
                     <a:xfrm>
                       <a:off x="0" y="0"/>
                       <a:ext cx="5029200" cy="4934309"/>
+                    </a:xfrm>
+                    <a:prstGeom prst="rect"/>
+                  </pic:spPr>
+                </pic:pic>
+              </a:graphicData>
+            </a:graphic>
+          </wp:inline>
+        </w:drawing>
+      </w:r>
+    </w:p>
+    <w:p>
+      <w:pPr>
+        <w:pStyle w:val="Heading3"/>
+      </w:pPr>
+      <w:r>
+        <w:t>SAM2 Masked CNN Confusion Matrix (Testing Data)</w:t>
+      </w:r>
+    </w:p>
+    <w:p>
+      <w:pPr>
+        <w:jc w:val="center"/>
+      </w:pPr>
+      <w:r>
+        <w:drawing>
+          <wp:inline xmlns:a="http://schemas.openxmlformats.org/drawingml/2006/main" xmlns:pic="http://schemas.openxmlformats.org/drawingml/2006/picture">
+            <wp:extent cx="5029200" cy="4310743"/>
+            <wp:docPr id="6" name="Picture 6"/>
+            <wp:cNvGraphicFramePr>
+              <a:graphicFrameLocks noChangeAspect="1"/>
+            </wp:cNvGraphicFramePr>
+            <a:graphic>
+              <a:graphicData uri="http://schemas.openxmlformats.org/drawingml/2006/picture">
+                <pic:pic>
+                  <pic:nvPicPr>
+                    <pic:cNvPr id="0" name="masked_cnn_confusion.png"/>
+                    <pic:cNvPicPr/>
+                  </pic:nvPicPr>
+                  <pic:blipFill>
+                    <a:blip r:embed="rId14"/>
+                    <a:stretch>
+                      <a:fillRect/>
+                    </a:stretch>
+                  </pic:blipFill>
+                  <pic:spPr>
+                    <a:xfrm>
+                      <a:off x="0" y="0"/>
+                      <a:ext cx="5029200" cy="4310743"/>
+                    </a:xfrm>
+                    <a:prstGeom prst="rect"/>
+                  </pic:spPr>
+                </pic:pic>
+              </a:graphicData>
+            </a:graphic>
+          </wp:inline>
+        </w:drawing>
+      </w:r>
+    </w:p>
+    <w:p>
+      <w:pPr>
+        <w:pStyle w:val="Heading3"/>
+      </w:pPr>
+      <w:r>
+        <w:t>Full Model Comparison (17 models)</w:t>
+      </w:r>
+    </w:p>
+    <w:p>
+      <w:pPr>
+        <w:jc w:val="center"/>
+      </w:pPr>
+      <w:r>
+        <w:drawing>
+          <wp:inline xmlns:a="http://schemas.openxmlformats.org/drawingml/2006/main" xmlns:pic="http://schemas.openxmlformats.org/drawingml/2006/picture">
+            <wp:extent cx="5029200" cy="3566160"/>
+            <wp:docPr id="7" name="Picture 7"/>
+            <wp:cNvGraphicFramePr>
+              <a:graphicFrameLocks noChangeAspect="1"/>
+            </wp:cNvGraphicFramePr>
+            <a:graphic>
+              <a:graphicData uri="http://schemas.openxmlformats.org/drawingml/2006/picture">
+                <pic:pic>
+                  <pic:nvPicPr>
+                    <pic:cNvPr id="0" name="experiment_comparison.png"/>
+                    <pic:cNvPicPr/>
+                  </pic:nvPicPr>
+                  <pic:blipFill>
+                    <a:blip r:embed="rId15"/>
+                    <a:stretch>
+                      <a:fillRect/>
+                    </a:stretch>
+                  </pic:blipFill>
+                  <pic:spPr>
+                    <a:xfrm>
+                      <a:off x="0" y="0"/>
+                      <a:ext cx="5029200" cy="3566160"/>
                     </a:xfrm>
                     <a:prstGeom prst="rect"/>
                   </pic:spPr>

</xml_diff>

<commit_message>
docs: add pixel-wise segmentation results to experiment comparison and writeup (19 models)
</commit_message>
<xml_diff>
--- a/docs/Final_Project_Writeup.docx
+++ b/docs/Final_Project_Writeup.docx
@@ -362,11 +362,88 @@
           </w:p>
         </w:tc>
       </w:tr>
+      <w:tr>
+        <w:tc>
+          <w:tcPr>
+            <w:tcW w:type="dxa" w:w="2880"/>
+          </w:tcPr>
+          <w:p>
+            <w:r>
+              <w:t>DeepLabV3+ ResNet50</w:t>
+            </w:r>
+          </w:p>
+        </w:tc>
+        <w:tc>
+          <w:tcPr>
+            <w:tcW w:type="dxa" w:w="2880"/>
+          </w:tcPr>
+          <w:p>
+            <w:r>
+              <w:t>Pixel wise semantic segmentation</w:t>
+            </w:r>
+          </w:p>
+        </w:tc>
+        <w:tc>
+          <w:tcPr>
+            <w:tcW w:type="dxa" w:w="2880"/>
+          </w:tcPr>
+          <w:p>
+            <w:r>
+              <w:t>40.98 percent mIoU, 86.18 percent pixel acc</w:t>
+            </w:r>
+          </w:p>
+        </w:tc>
+      </w:tr>
+      <w:tr>
+        <w:tc>
+          <w:tcPr>
+            <w:tcW w:type="dxa" w:w="2880"/>
+          </w:tcPr>
+          <w:p>
+            <w:r>
+              <w:t>YOLOv8n seg (5 class)</w:t>
+            </w:r>
+          </w:p>
+        </w:tc>
+        <w:tc>
+          <w:tcPr>
+            <w:tcW w:type="dxa" w:w="2880"/>
+          </w:tcPr>
+          <w:p>
+            <w:r>
+              <w:t>Instance segmentation</w:t>
+            </w:r>
+          </w:p>
+        </w:tc>
+        <w:tc>
+          <w:tcPr>
+            <w:tcW w:type="dxa" w:w="2880"/>
+          </w:tcPr>
+          <w:p>
+            <w:r>
+              <w:t>40.0 percent box mAP50, 14.1 percent mask mAP50</w:t>
+            </w:r>
+          </w:p>
+        </w:tc>
+      </w:tr>
     </w:tbl>
     <w:p>
       <w:r>
         <w:br/>
-        <w:t>As the table shows, the custom Convolutional Neural Network achieved 87.33 percent, which vastly outperformed traditional machine learning models but lacked scalable depth. A blank ResNet parameter model trained strictly from scratch achieved 79.23 percent. This proved that large networks struggle heavily without pretrained generalized anchors. However, a frozen ResNet loaded with ImageNet weights efficiently achieved 79.82 percent just by training its final layer. A natively fine tuned Vision Transformer achieved state of the art pure classification precision at 93.90 percent. Our end to end YOLOv8n detector trained directly on all five PPE classes achieved a strong mAP50 of 86.3 percent across 2609 scenes. The SAM2 masked CNN experiment showed that zeroing out scene backgrounds actually reduced accuracy to 74.48 percent, demonstrating that contextual body and scene information assists classification rather than harming it.</w:t>
+        <w:t>As the table shows, the custom Convolutional Neural Network achieved 87.33 percent, which vastly outperformed traditional machine learning models but lacked scalable depth. A blank ResNet parameter model trained strictly from scratch achieved 79.23 percent. This proved that large networks struggle heavily without pretrained generalized anchors. However, a frozen ResNet loaded with ImageNet weights efficiently achieved 79.82 percent just by training its final layer. A natively fine tuned Vision Transformer achieved state of the art pure classification precision at 93.90 percent. Our end to end YOLOv8n detector trained directly on all five PPE classes achieved a strong mAP50 of 86.3 percent across 2609 scenes. The SAM2 masked CNN experiment showed that zeroing out scene backgrounds actually reduced accuracy to 74.48 percent, demonstrating that contextual body and scene information assists classification rather than harming it. Our DeepLabV3+ semantic segmentation model achieved a mean IoU of 40.98 percent and a pixel accuracy of 86.18 percent across six classes including background. Our YOLOv8n instance segmentation model achieved a box mAP50 of 40.0 percent and a mask mAP50 of 14.1 percent across five PPE classes.</w:t>
+      </w:r>
+    </w:p>
+    <w:p>
+      <w:pPr>
+        <w:pStyle w:val="Heading2"/>
+      </w:pPr>
+      <w:r>
+        <w:t>Pixel-Wise PPE Analysis</w:t>
+      </w:r>
+    </w:p>
+    <w:p>
+      <w:r>
+        <w:t>To push beyond classification into precise spatial understanding, we extended our pipeline with two pixel level models. Our first approach used a DeepLabV3+ architecture with a pretrained ResNet50 backbone fine tuned for six class semantic segmentation. Each pixel in a scene was assigned one of five PPE classes or background. After 30 epochs on 1368 training images derived from the MinhNKB dataset with SAM2 generated instance masks, the model achieved a mean IoU of 40.98 percent and a pixel accuracy of 86.18 percent. The high pixel accuracy reflects strong background identification, while the lower mean IoU reveals that rare PPE classes like safety vest and helmet remain challenging to segment precisely at the pixel level. Our second approach used YOLOv8n seg trained on the same instance segmentation dataset with polygon masks derived from SAM2 box prompted segmentation. This model achieved a box mAP50 of 40.0 percent and a mask mAP50 of 14.1 percent, demonstrating that instance level pixel labelling is significantly harder than box detection or classification. The gap between box and mask scores shows the model can locate PPE items well but struggles to precisely delineate their boundaries at pixel resolution. Together these experiments establish a complete spectrum: from whole image classification at 93.9 percent accuracy through object detection at 86.3 percent mAP50 to pixel precise semantic segmentation at 40.98 percent mIoU and instance segmentation at 14.1 percent mask mAP50. This progression reflects the fundamental tradeoff between task complexity and achievable performance given the dataset size.</w:t>
       </w:r>
     </w:p>
     <w:p>
@@ -682,7 +759,7 @@
         <w:pStyle w:val="Heading3"/>
       </w:pPr>
       <w:r>
-        <w:t>Full Model Comparison (17 models)</w:t>
+        <w:t>DeepLabV3+ Per-Class IoU (Semantic Segmentation)</w:t>
       </w:r>
     </w:p>
     <w:p>
@@ -692,8 +769,149 @@
       <w:r>
         <w:drawing>
           <wp:inline xmlns:a="http://schemas.openxmlformats.org/drawingml/2006/main" xmlns:pic="http://schemas.openxmlformats.org/drawingml/2006/picture">
-            <wp:extent cx="5029200" cy="3566160"/>
+            <wp:extent cx="5029200" cy="2235200"/>
             <wp:docPr id="7" name="Picture 7"/>
+            <wp:cNvGraphicFramePr>
+              <a:graphicFrameLocks noChangeAspect="1"/>
+            </wp:cNvGraphicFramePr>
+            <a:graphic>
+              <a:graphicData uri="http://schemas.openxmlformats.org/drawingml/2006/picture">
+                <pic:pic>
+                  <pic:nvPicPr>
+                    <pic:cNvPr id="0" name="deeplab_confusion.png"/>
+                    <pic:cNvPicPr/>
+                  </pic:nvPicPr>
+                  <pic:blipFill>
+                    <a:blip r:embed="rId15"/>
+                    <a:stretch>
+                      <a:fillRect/>
+                    </a:stretch>
+                  </pic:blipFill>
+                  <pic:spPr>
+                    <a:xfrm>
+                      <a:off x="0" y="0"/>
+                      <a:ext cx="5029200" cy="2235200"/>
+                    </a:xfrm>
+                    <a:prstGeom prst="rect"/>
+                  </pic:spPr>
+                </pic:pic>
+              </a:graphicData>
+            </a:graphic>
+          </wp:inline>
+        </w:drawing>
+      </w:r>
+    </w:p>
+    <w:p>
+      <w:pPr>
+        <w:pStyle w:val="Heading3"/>
+      </w:pPr>
+      <w:r>
+        <w:t>DeepLabV3+ Sample Predictions (Image vs Segmentation Mask)</w:t>
+      </w:r>
+    </w:p>
+    <w:p>
+      <w:pPr>
+        <w:jc w:val="center"/>
+      </w:pPr>
+      <w:r>
+        <w:drawing>
+          <wp:inline xmlns:a="http://schemas.openxmlformats.org/drawingml/2006/main" xmlns:pic="http://schemas.openxmlformats.org/drawingml/2006/picture">
+            <wp:extent cx="5029200" cy="5029200"/>
+            <wp:docPr id="8" name="Picture 8"/>
+            <wp:cNvGraphicFramePr>
+              <a:graphicFrameLocks noChangeAspect="1"/>
+            </wp:cNvGraphicFramePr>
+            <a:graphic>
+              <a:graphicData uri="http://schemas.openxmlformats.org/drawingml/2006/picture">
+                <pic:pic>
+                  <pic:nvPicPr>
+                    <pic:cNvPr id="0" name="deeplab_pred_grid.png"/>
+                    <pic:cNvPicPr/>
+                  </pic:nvPicPr>
+                  <pic:blipFill>
+                    <a:blip r:embed="rId16"/>
+                    <a:stretch>
+                      <a:fillRect/>
+                    </a:stretch>
+                  </pic:blipFill>
+                  <pic:spPr>
+                    <a:xfrm>
+                      <a:off x="0" y="0"/>
+                      <a:ext cx="5029200" cy="5029200"/>
+                    </a:xfrm>
+                    <a:prstGeom prst="rect"/>
+                  </pic:spPr>
+                </pic:pic>
+              </a:graphicData>
+            </a:graphic>
+          </wp:inline>
+        </w:drawing>
+      </w:r>
+    </w:p>
+    <w:p>
+      <w:pPr>
+        <w:pStyle w:val="Heading3"/>
+      </w:pPr>
+      <w:r>
+        <w:t>YOLOv8n-seg Instance Segmentation Confusion Matrix</w:t>
+      </w:r>
+    </w:p>
+    <w:p>
+      <w:pPr>
+        <w:jc w:val="center"/>
+      </w:pPr>
+      <w:r>
+        <w:drawing>
+          <wp:inline xmlns:a="http://schemas.openxmlformats.org/drawingml/2006/main" xmlns:pic="http://schemas.openxmlformats.org/drawingml/2006/picture">
+            <wp:extent cx="5029200" cy="3771900"/>
+            <wp:docPr id="9" name="Picture 9"/>
+            <wp:cNvGraphicFramePr>
+              <a:graphicFrameLocks noChangeAspect="1"/>
+            </wp:cNvGraphicFramePr>
+            <a:graphic>
+              <a:graphicData uri="http://schemas.openxmlformats.org/drawingml/2006/picture">
+                <pic:pic>
+                  <pic:nvPicPr>
+                    <pic:cNvPr id="0" name="yolo_seg_confusion.png"/>
+                    <pic:cNvPicPr/>
+                  </pic:nvPicPr>
+                  <pic:blipFill>
+                    <a:blip r:embed="rId17"/>
+                    <a:stretch>
+                      <a:fillRect/>
+                    </a:stretch>
+                  </pic:blipFill>
+                  <pic:spPr>
+                    <a:xfrm>
+                      <a:off x="0" y="0"/>
+                      <a:ext cx="5029200" cy="3771900"/>
+                    </a:xfrm>
+                    <a:prstGeom prst="rect"/>
+                  </pic:spPr>
+                </pic:pic>
+              </a:graphicData>
+            </a:graphic>
+          </wp:inline>
+        </w:drawing>
+      </w:r>
+    </w:p>
+    <w:p>
+      <w:pPr>
+        <w:pStyle w:val="Heading3"/>
+      </w:pPr>
+      <w:r>
+        <w:t>Full Model Comparison (19 models)</w:t>
+      </w:r>
+    </w:p>
+    <w:p>
+      <w:pPr>
+        <w:jc w:val="center"/>
+      </w:pPr>
+      <w:r>
+        <w:drawing>
+          <wp:inline xmlns:a="http://schemas.openxmlformats.org/drawingml/2006/main" xmlns:pic="http://schemas.openxmlformats.org/drawingml/2006/picture">
+            <wp:extent cx="5029200" cy="4124959"/>
+            <wp:docPr id="10" name="Picture 10"/>
             <wp:cNvGraphicFramePr>
               <a:graphicFrameLocks noChangeAspect="1"/>
             </wp:cNvGraphicFramePr>
@@ -705,7 +923,7 @@
                     <pic:cNvPicPr/>
                   </pic:nvPicPr>
                   <pic:blipFill>
-                    <a:blip r:embed="rId15"/>
+                    <a:blip r:embed="rId18"/>
                     <a:stretch>
                       <a:fillRect/>
                     </a:stretch>
@@ -713,7 +931,7 @@
                   <pic:spPr>
                     <a:xfrm>
                       <a:off x="0" y="0"/>
-                      <a:ext cx="5029200" cy="3566160"/>
+                      <a:ext cx="5029200" cy="4124959"/>
                     </a:xfrm>
                     <a:prstGeom prst="rect"/>
                   </pic:spPr>

</xml_diff>